<commit_message>
listing 2 ways to deployment this pet project
</commit_message>
<xml_diff>
--- a/docs/cachchoi.docx
+++ b/docs/cachchoi.docx
@@ -95,23 +95,13 @@
       </w:pPr>
       <w:r>
         <w:rPr>
-          <w:rFonts w:ascii="Segoe UI Emoji" w:eastAsia="Times New Roman" w:hAnsi="Segoe UI Emoji" w:cs="Segoe UI Emoji"/>
+          <w:rFonts w:ascii="Times New Roman" w:eastAsia="Times New Roman" w:hAnsi="Times New Roman" w:cs="Times New Roman"/>
           <w:b/>
           <w:bCs/>
           <w:sz w:val="27"/>
           <w:szCs w:val="27"/>
         </w:rPr>
-        <w:t>🎮</w:t>
-      </w:r>
-      <w:r>
-        <w:rPr>
-          <w:rFonts w:ascii="Times New Roman" w:eastAsia="Times New Roman" w:hAnsi="Times New Roman" w:cs="Times New Roman"/>
-          <w:b/>
-          <w:bCs/>
-          <w:sz w:val="27"/>
-          <w:szCs w:val="27"/>
-        </w:rPr>
-        <w:t xml:space="preserve"> Phần 2: Hướng dẫn cách chơi (Dùng cho Modal / Nút "Cách chơi")</w:t>
+        <w:t>Phần 2: Hướng dẫn cách chơi (Dùng cho Modal / Nút "Cách chơi")</w:t>
       </w:r>
     </w:p>
     <w:p>
@@ -561,22 +551,6 @@
       </w:pPr>
       <w:r>
         <w:rPr>
-          <w:rFonts w:ascii="Segoe UI Emoji" w:eastAsia="Times New Roman" w:hAnsi="Segoe UI Emoji" w:cs="Segoe UI Emoji"/>
-          <w:sz w:val="24"/>
-          <w:szCs w:val="24"/>
-        </w:rPr>
-        <w:t>🏆</w:t>
-      </w:r>
-      <w:r>
-        <w:rPr>
-          <w:rFonts w:ascii="Times New Roman" w:eastAsia="Times New Roman" w:hAnsi="Times New Roman" w:cs="Times New Roman"/>
-          <w:sz w:val="24"/>
-          <w:szCs w:val="24"/>
-        </w:rPr>
-        <w:t xml:space="preserve"> </w:t>
-      </w:r>
-      <w:r>
-        <w:rPr>
           <w:rFonts w:ascii="Times New Roman" w:eastAsia="Times New Roman" w:hAnsi="Times New Roman" w:cs="Times New Roman"/>
           <w:b/>
           <w:bCs/>
@@ -614,14 +588,6 @@
           <w:szCs w:val="24"/>
         </w:rPr>
         <w:t>🏆</w:t>
-      </w:r>
-      <w:r>
-        <w:rPr>
-          <w:rFonts w:ascii="Times New Roman" w:eastAsia="Times New Roman" w:hAnsi="Times New Roman" w:cs="Times New Roman"/>
-          <w:sz w:val="24"/>
-          <w:szCs w:val="24"/>
-        </w:rPr>
-        <w:t xml:space="preserve"> </w:t>
       </w:r>
       <w:r>
         <w:rPr>

</xml_diff>